<commit_message>
cambios al ejercicio 3
</commit_message>
<xml_diff>
--- a/IDM_TP_Clasificacion_resolucion.docx
+++ b/IDM_TP_Clasificacion_resolucion.docx
@@ -23,7 +23,7 @@
         <w:pStyle w:val="Date"/>
       </w:pPr>
       <w:r>
-        <w:t xml:space="preserve">17 de junio de 2026</w:t>
+        <w:t xml:space="preserve">21 de junio de 2026</w:t>
       </w:r>
     </w:p>
     <w:sdt>
@@ -1713,10 +1713,10 @@
           <w:b/>
           <w:bCs/>
         </w:rPr>
-        <w:t xml:space="preserve">105</w:t>
-      </w:r>
-      <w:r>
-        <w:t xml:space="preserve">, ya que presenta el menor índice de Gini ponderado (0,32) entre todos los candidatos evaluados. La condición de prueba asociada al nodo es</w:t>
+        <w:t xml:space="preserve">87,5</w:t>
+      </w:r>
+      <w:r>
+        <w:t xml:space="preserve">, ya que presenta el menor índice de Gini ponderado (0,2857) entre todos los candidatos evaluados. La condición de prueba asociada al nodo es</w:t>
       </w:r>
       <w:r>
         <w:t xml:space="preserve"> </w:t>
@@ -1736,11 +1736,29 @@
           <m:t>≤</m:t>
         </m:r>
         <m:r>
-          <m:t>105</m:t>
+          <m:t>87</m:t>
+        </m:r>
+        <m:r>
+          <m:rPr>
+            <m:sty m:val="p"/>
+          </m:rPr>
+          <m:t>,</m:t>
+        </m:r>
+        <m:r>
+          <m:t>5</m:t>
         </m:r>
       </m:oMath>
       <w:r>
-        <w:t xml:space="preserve">. Esta condición divide el conjunto de datos en dos subconjuntos: los contribuyentes con ingreso imponible menor o igual a 105 se asignan a la rama izquierda del árbol, mientras que aquellos con ingreso superior a 105 se asignan a la rama derecha.</w:t>
+        <w:t xml:space="preserve">. Esta condición divide el conjunto de datos en dos subconjuntos: los contribuyentes con ingreso imponible menor o igual a 87,5 se asignan a la rama izquierda del árbol (nodo puro de clase</w:t>
+      </w:r>
+      <w:r>
+        <w:t xml:space="preserve"> </w:t>
+      </w:r>
+      <w:r>
+        <w:t xml:space="preserve">“No”</w:t>
+      </w:r>
+      <w:r>
+        <w:t xml:space="preserve">), mientras que aquellos con ingreso superior a 87,5 se asignan a la rama derecha.</w:t>
       </w:r>
     </w:p>
     <w:p>
@@ -5132,9 +5150,11 @@
         </w:rPr>
         <w:t xml:space="preserve">b) Para cada regla, indique su cobertura (la cantidad de instancias del Conjunto de Datos 1 que satisface su antecedente) y su exactitud sobre dichas instancias.</w:t>
       </w:r>
-      <w:r>
-        <w:t xml:space="preserve"> </w:t>
-      </w:r>
+    </w:p>
+    <w:p>
+      <w:pPr>
+        <w:pStyle w:val="BodyText"/>
+      </w:pPr>
       <w:r>
         <w:t xml:space="preserve">La</w:t>
       </w:r>
@@ -5229,380 +5249,254 @@
     </w:p>
     <w:p>
       <w:pPr>
-        <w:pStyle w:val="TableCaption"/>
+        <w:pStyle w:val="FirstParagraph"/>
       </w:pPr>
       <w:r>
         <w:t xml:space="preserve">Cobertura y exactitud de las reglas derivadas del árbol de decisión</w:t>
       </w:r>
     </w:p>
-    <w:tbl>
-      <w:tblPr>
-        <w:tblStyle w:val="Table"/>
-        <w:tblW w:type="pct" w:w="5000"/>
-        <w:tblLayout w:type="fixed"/>
-        <w:tblLook w:firstRow="1" w:lastRow="0" w:firstColumn="0" w:lastColumn="0" w:noHBand="0" w:noVBand="0" w:val="0020"/>
-        <w:tblCaption w:val="Cobertura y exactitud de las reglas derivadas del árbol de decisión"/>
-      </w:tblPr>
-      <w:tblGrid>
-        <w:gridCol w:w="609"/>
-        <w:gridCol w:w="5076"/>
-        <w:gridCol w:w="1116"/>
-        <w:gridCol w:w="1116"/>
-      </w:tblGrid>
-      <w:tr>
-        <w:trPr>
-          <w:tblHeader w:val="on"/>
-        </w:trPr>
-        <w:tc>
-          <w:tcPr/>
-          <w:p>
-            <w:pPr>
-              <w:pStyle w:val="Compact"/>
-              <w:jc w:val="left"/>
-            </w:pPr>
-            <w:r>
-              <w:t xml:space="preserve">Regla</w:t>
-            </w:r>
-          </w:p>
-        </w:tc>
-        <w:tc>
-          <w:tcPr/>
-          <w:p>
-            <w:pPr>
-              <w:pStyle w:val="Compact"/>
-              <w:jc w:val="left"/>
-            </w:pPr>
-            <w:r>
-              <w:t xml:space="preserve">Antecedente</w:t>
-            </w:r>
-          </w:p>
-        </w:tc>
-        <w:tc>
-          <w:tcPr/>
-          <w:p>
-            <w:pPr>
-              <w:pStyle w:val="Compact"/>
-              <w:jc w:val="center"/>
-            </w:pPr>
-            <w:r>
-              <w:t xml:space="preserve">Cobertura</w:t>
-            </w:r>
-          </w:p>
-        </w:tc>
-        <w:tc>
-          <w:tcPr/>
-          <w:p>
-            <w:pPr>
-              <w:pStyle w:val="Compact"/>
-              <w:jc w:val="center"/>
-            </w:pPr>
-            <w:r>
-              <w:t xml:space="preserve">Exactitud</w:t>
-            </w:r>
-          </w:p>
-        </w:tc>
-      </w:tr>
-      <w:tr>
-        <w:tc>
-          <w:tcPr/>
-          <w:p>
-            <w:pPr>
-              <w:pStyle w:val="Compact"/>
-              <w:jc w:val="left"/>
-            </w:pPr>
-            <w:r>
-              <w:t xml:space="preserve">R1</w:t>
-            </w:r>
-          </w:p>
-        </w:tc>
-        <w:tc>
-          <w:tcPr/>
-          <w:p>
-            <w:pPr>
-              <w:pStyle w:val="Compact"/>
-              <w:jc w:val="left"/>
-            </w:pPr>
-            <w:r>
-              <w:t xml:space="preserve">Ingreso = Alto</w:t>
-            </w:r>
-          </w:p>
-        </w:tc>
-        <w:tc>
-          <w:tcPr/>
-          <w:p>
-            <w:pPr>
-              <w:pStyle w:val="Compact"/>
-              <w:jc w:val="center"/>
-            </w:pPr>
-            <w:r>
-              <w:t xml:space="preserve">4</w:t>
-            </w:r>
-          </w:p>
-        </w:tc>
-        <w:tc>
-          <w:tcPr/>
-          <w:p>
-            <w:pPr>
-              <w:pStyle w:val="Compact"/>
-              <w:jc w:val="center"/>
-            </w:pPr>
-            <w:r>
-              <w:t xml:space="preserve">100%</w:t>
-            </w:r>
-          </w:p>
-        </w:tc>
-      </w:tr>
-      <w:tr>
-        <w:tc>
-          <w:tcPr/>
-          <w:p>
-            <w:pPr>
-              <w:pStyle w:val="Compact"/>
-              <w:jc w:val="left"/>
-            </w:pPr>
-            <w:r>
-              <w:t xml:space="preserve">R2</w:t>
-            </w:r>
-          </w:p>
-        </w:tc>
-        <w:tc>
-          <w:tcPr/>
-          <w:p>
-            <w:pPr>
-              <w:pStyle w:val="Compact"/>
-              <w:jc w:val="left"/>
-            </w:pPr>
-            <w:r>
-              <w:t xml:space="preserve">Ingreso = Medio e Historial = Bueno</w:t>
-            </w:r>
-          </w:p>
-        </w:tc>
-        <w:tc>
-          <w:tcPr/>
-          <w:p>
-            <w:pPr>
-              <w:pStyle w:val="Compact"/>
-              <w:jc w:val="center"/>
-            </w:pPr>
-            <w:r>
-              <w:t xml:space="preserve">3</w:t>
-            </w:r>
-          </w:p>
-        </w:tc>
-        <w:tc>
-          <w:tcPr/>
-          <w:p>
-            <w:pPr>
-              <w:pStyle w:val="Compact"/>
-              <w:jc w:val="center"/>
-            </w:pPr>
-            <w:r>
-              <w:t xml:space="preserve">100%</w:t>
-            </w:r>
-          </w:p>
-        </w:tc>
-      </w:tr>
-      <w:tr>
-        <w:tc>
-          <w:tcPr/>
-          <w:p>
-            <w:pPr>
-              <w:pStyle w:val="Compact"/>
-              <w:jc w:val="left"/>
-            </w:pPr>
-            <w:r>
-              <w:t xml:space="preserve">R3</w:t>
-            </w:r>
-          </w:p>
-        </w:tc>
-        <w:tc>
-          <w:tcPr/>
-          <w:p>
-            <w:pPr>
-              <w:pStyle w:val="Compact"/>
-              <w:jc w:val="left"/>
-            </w:pPr>
-            <w:r>
-              <w:t xml:space="preserve">Ingreso = Medio e Historial = Malo</w:t>
-            </w:r>
-          </w:p>
-        </w:tc>
-        <w:tc>
-          <w:tcPr/>
-          <w:p>
-            <w:pPr>
-              <w:pStyle w:val="Compact"/>
-              <w:jc w:val="center"/>
-            </w:pPr>
-            <w:r>
-              <w:t xml:space="preserve">2</w:t>
-            </w:r>
-          </w:p>
-        </w:tc>
-        <w:tc>
-          <w:tcPr/>
-          <w:p>
-            <w:pPr>
-              <w:pStyle w:val="Compact"/>
-              <w:jc w:val="center"/>
-            </w:pPr>
-            <w:r>
-              <w:t xml:space="preserve">100%</w:t>
-            </w:r>
-          </w:p>
-        </w:tc>
-      </w:tr>
-      <w:tr>
-        <w:tc>
-          <w:tcPr/>
-          <w:p>
-            <w:pPr>
-              <w:pStyle w:val="Compact"/>
-              <w:jc w:val="left"/>
-            </w:pPr>
-            <w:r>
-              <w:t xml:space="preserve">R4</w:t>
-            </w:r>
-          </w:p>
-        </w:tc>
-        <w:tc>
-          <w:tcPr/>
-          <w:p>
-            <w:pPr>
-              <w:pStyle w:val="Compact"/>
-              <w:jc w:val="left"/>
-            </w:pPr>
-            <w:r>
-              <w:t xml:space="preserve">Ingreso = Bajo e Historial = Malo</w:t>
-            </w:r>
-          </w:p>
-        </w:tc>
-        <w:tc>
-          <w:tcPr/>
-          <w:p>
-            <w:pPr>
-              <w:pStyle w:val="Compact"/>
-              <w:jc w:val="center"/>
-            </w:pPr>
-            <w:r>
-              <w:t xml:space="preserve">3</w:t>
-            </w:r>
-          </w:p>
-        </w:tc>
-        <w:tc>
-          <w:tcPr/>
-          <w:p>
-            <w:pPr>
-              <w:pStyle w:val="Compact"/>
-              <w:jc w:val="center"/>
-            </w:pPr>
-            <w:r>
-              <w:t xml:space="preserve">100%</w:t>
-            </w:r>
-          </w:p>
-        </w:tc>
-      </w:tr>
-      <w:tr>
-        <w:tc>
-          <w:tcPr/>
-          <w:p>
-            <w:pPr>
-              <w:pStyle w:val="Compact"/>
-              <w:jc w:val="left"/>
-            </w:pPr>
-            <w:r>
-              <w:t xml:space="preserve">R5</w:t>
-            </w:r>
-          </w:p>
-        </w:tc>
-        <w:tc>
-          <w:tcPr/>
-          <w:p>
-            <w:pPr>
-              <w:pStyle w:val="Compact"/>
-              <w:jc w:val="left"/>
-            </w:pPr>
-            <w:r>
-              <w:t xml:space="preserve">Ingreso = Bajo e Historial = Bueno y Deuda = Baja</w:t>
-            </w:r>
-          </w:p>
-        </w:tc>
-        <w:tc>
-          <w:tcPr/>
-          <w:p>
-            <w:pPr>
-              <w:pStyle w:val="Compact"/>
-              <w:jc w:val="center"/>
-            </w:pPr>
-            <w:r>
-              <w:t xml:space="preserve">1</w:t>
-            </w:r>
-          </w:p>
-        </w:tc>
-        <w:tc>
-          <w:tcPr/>
-          <w:p>
-            <w:pPr>
-              <w:pStyle w:val="Compact"/>
-              <w:jc w:val="center"/>
-            </w:pPr>
-            <w:r>
-              <w:t xml:space="preserve">100%</w:t>
-            </w:r>
-          </w:p>
-        </w:tc>
-      </w:tr>
-      <w:tr>
-        <w:tc>
-          <w:tcPr/>
-          <w:p>
-            <w:pPr>
-              <w:pStyle w:val="Compact"/>
-              <w:jc w:val="left"/>
-            </w:pPr>
-            <w:r>
-              <w:t xml:space="preserve">R6</w:t>
-            </w:r>
-          </w:p>
-        </w:tc>
-        <w:tc>
-          <w:tcPr/>
-          <w:p>
-            <w:pPr>
-              <w:pStyle w:val="Compact"/>
-              <w:jc w:val="left"/>
-            </w:pPr>
-            <w:r>
-              <w:t xml:space="preserve">Ingreso = Bajo e Historial = Bueno y Deuda = Alta</w:t>
-            </w:r>
-          </w:p>
-        </w:tc>
-        <w:tc>
-          <w:tcPr/>
-          <w:p>
-            <w:pPr>
-              <w:pStyle w:val="Compact"/>
-              <w:jc w:val="center"/>
-            </w:pPr>
-            <w:r>
-              <w:t xml:space="preserve">1</w:t>
-            </w:r>
-          </w:p>
-        </w:tc>
-        <w:tc>
-          <w:tcPr/>
-          <w:p>
-            <w:pPr>
-              <w:pStyle w:val="Compact"/>
-              <w:jc w:val="center"/>
-            </w:pPr>
-            <w:r>
-              <w:t xml:space="preserve">100%</w:t>
-            </w:r>
-          </w:p>
-        </w:tc>
-      </w:tr>
-    </w:tbl>
+    <w:p>
+      <w:pPr>
+        <w:pStyle w:val="BodyText"/>
+      </w:pPr>
+      <w:r>
+        <w:t xml:space="preserve">Regla</w:t>
+      </w:r>
+    </w:p>
+    <w:p>
+      <w:pPr>
+        <w:pStyle w:val="BodyText"/>
+      </w:pPr>
+      <w:r>
+        <w:t xml:space="preserve">Antecedente</w:t>
+      </w:r>
+    </w:p>
+    <w:p>
+      <w:pPr>
+        <w:pStyle w:val="BodyText"/>
+      </w:pPr>
+      <w:r>
+        <w:t xml:space="preserve">Cobertura</w:t>
+      </w:r>
+    </w:p>
+    <w:p>
+      <w:pPr>
+        <w:pStyle w:val="BodyText"/>
+      </w:pPr>
+      <w:r>
+        <w:t xml:space="preserve">Exactitud</w:t>
+      </w:r>
+    </w:p>
+    <w:p>
+      <w:pPr>
+        <w:pStyle w:val="BodyText"/>
+      </w:pPr>
+      <w:r>
+        <w:t xml:space="preserve">R1</w:t>
+      </w:r>
+    </w:p>
+    <w:p>
+      <w:pPr>
+        <w:pStyle w:val="BodyText"/>
+      </w:pPr>
+      <w:r>
+        <w:t xml:space="preserve">Ingreso = Alto</w:t>
+      </w:r>
+    </w:p>
+    <w:p>
+      <w:pPr>
+        <w:pStyle w:val="BodyText"/>
+      </w:pPr>
+      <w:r>
+        <w:t xml:space="preserve">4</w:t>
+      </w:r>
+    </w:p>
+    <w:p>
+      <w:pPr>
+        <w:pStyle w:val="BodyText"/>
+      </w:pPr>
+      <w:r>
+        <w:t xml:space="preserve">100%</w:t>
+      </w:r>
+    </w:p>
+    <w:p>
+      <w:pPr>
+        <w:pStyle w:val="BodyText"/>
+      </w:pPr>
+      <w:r>
+        <w:t xml:space="preserve">R2</w:t>
+      </w:r>
+    </w:p>
+    <w:p>
+      <w:pPr>
+        <w:pStyle w:val="BodyText"/>
+      </w:pPr>
+      <w:r>
+        <w:t xml:space="preserve">Ingreso = Medio e Historial = Bueno</w:t>
+      </w:r>
+    </w:p>
+    <w:p>
+      <w:pPr>
+        <w:pStyle w:val="BodyText"/>
+      </w:pPr>
+      <w:r>
+        <w:t xml:space="preserve">3</w:t>
+      </w:r>
+    </w:p>
+    <w:p>
+      <w:pPr>
+        <w:pStyle w:val="BodyText"/>
+      </w:pPr>
+      <w:r>
+        <w:t xml:space="preserve">100%</w:t>
+      </w:r>
+    </w:p>
+    <w:p>
+      <w:pPr>
+        <w:pStyle w:val="BodyText"/>
+      </w:pPr>
+      <w:r>
+        <w:t xml:space="preserve">R3</w:t>
+      </w:r>
+    </w:p>
+    <w:p>
+      <w:pPr>
+        <w:pStyle w:val="BodyText"/>
+      </w:pPr>
+      <w:r>
+        <w:t xml:space="preserve">Ingreso = Medio e Historial = Malo</w:t>
+      </w:r>
+    </w:p>
+    <w:p>
+      <w:pPr>
+        <w:pStyle w:val="BodyText"/>
+      </w:pPr>
+      <w:r>
+        <w:t xml:space="preserve">2</w:t>
+      </w:r>
+    </w:p>
+    <w:p>
+      <w:pPr>
+        <w:pStyle w:val="BodyText"/>
+      </w:pPr>
+      <w:r>
+        <w:t xml:space="preserve">100%</w:t>
+      </w:r>
+    </w:p>
+    <w:p>
+      <w:pPr>
+        <w:pStyle w:val="BodyText"/>
+      </w:pPr>
+      <w:r>
+        <w:t xml:space="preserve">R4</w:t>
+      </w:r>
+    </w:p>
+    <w:p>
+      <w:pPr>
+        <w:pStyle w:val="BodyText"/>
+      </w:pPr>
+      <w:r>
+        <w:t xml:space="preserve">Ingreso = Bajo e Historial = Malo</w:t>
+      </w:r>
+    </w:p>
+    <w:p>
+      <w:pPr>
+        <w:pStyle w:val="BodyText"/>
+      </w:pPr>
+      <w:r>
+        <w:t xml:space="preserve">3</w:t>
+      </w:r>
+    </w:p>
+    <w:p>
+      <w:pPr>
+        <w:pStyle w:val="BodyText"/>
+      </w:pPr>
+      <w:r>
+        <w:t xml:space="preserve">100%</w:t>
+      </w:r>
+    </w:p>
+    <w:p>
+      <w:pPr>
+        <w:pStyle w:val="BodyText"/>
+      </w:pPr>
+      <w:r>
+        <w:t xml:space="preserve">R5</w:t>
+      </w:r>
+    </w:p>
+    <w:p>
+      <w:pPr>
+        <w:pStyle w:val="BodyText"/>
+      </w:pPr>
+      <w:r>
+        <w:t xml:space="preserve">Ingreso = Bajo e Historial = Bueno y Deuda = Baja</w:t>
+      </w:r>
+    </w:p>
+    <w:p>
+      <w:pPr>
+        <w:pStyle w:val="BodyText"/>
+      </w:pPr>
+      <w:r>
+        <w:t xml:space="preserve">1</w:t>
+      </w:r>
+    </w:p>
+    <w:p>
+      <w:pPr>
+        <w:pStyle w:val="BodyText"/>
+      </w:pPr>
+      <w:r>
+        <w:t xml:space="preserve">100%</w:t>
+      </w:r>
+    </w:p>
+    <w:p>
+      <w:pPr>
+        <w:pStyle w:val="BodyText"/>
+      </w:pPr>
+      <w:r>
+        <w:t xml:space="preserve">R6</w:t>
+      </w:r>
+    </w:p>
+    <w:p>
+      <w:pPr>
+        <w:pStyle w:val="BodyText"/>
+      </w:pPr>
+      <w:r>
+        <w:t xml:space="preserve">Ingreso = Bajo e Historial = Bueno y Deuda = Alta</w:t>
+      </w:r>
+    </w:p>
+    <w:p>
+      <w:pPr>
+        <w:pStyle w:val="BodyText"/>
+      </w:pPr>
+      <w:r>
+        <w:t xml:space="preserve">1</w:t>
+      </w:r>
+    </w:p>
+    <w:p>
+      <w:pPr>
+        <w:pStyle w:val="BodyText"/>
+      </w:pPr>
+      <w:r>
+        <w:t xml:space="preserve">100%</w:t>
+      </w:r>
+    </w:p>
+    <w:p>
+      <w:pPr>
+        <w:pStyle w:val="BodyText"/>
+      </w:pPr>
+      <w:r>
+        <w:rPr>
+          <w:i/>
+          <w:iCs/>
+        </w:rPr>
+        <w:t xml:space="preserve">Nota.</w:t>
+      </w:r>
+      <w:r>
+        <w:t xml:space="preserve"> </w:t>
+      </w:r>
+      <w:r>
+        <w:t xml:space="preserve">Elaboración propia a partir del árbol de decisión del Ejercicio 2.</w:t>
+      </w:r>
+    </w:p>
     <w:p>
       <w:pPr>
         <w:pStyle w:val="BodyText"/>

</xml_diff>

<commit_message>
Corrige detalles de redacción en las Partes A, D y E
Ajusta el documento a la guía de estilo del proyecto:

- Ejercicio 3 (Parte A): los intervalos de la tabla de puntos de corte
  pasan de la forma «60 - 70» (con guion intermedio) a «60 a 70».
- Ejercicio 10 (Parte D): se elimina el gerundio «memorizando» mediante
  una construcción subordinada («con lo que memorizaría»).
- Parte E: «reglas SI-ENTONCES» pasa a «reglas de tipo «si... entonces»»
  para evitar el guion intermedio.

Regenera el PDF y el Word.
</commit_message>
<xml_diff>
--- a/IDM_TP_Clasificacion_resolucion.docx
+++ b/IDM_TP_Clasificacion_resolucion.docx
@@ -843,7 +843,7 @@
         <w:pStyle w:val="BodyText"/>
       </w:pPr>
       <w:r>
-        <w:t xml:space="preserve">60 – 70</w:t>
+        <w:t xml:space="preserve">60 a 70</w:t>
       </w:r>
     </w:p>
     <w:p>
@@ -859,7 +859,7 @@
         <w:pStyle w:val="BodyText"/>
       </w:pPr>
       <w:r>
-        <w:t xml:space="preserve">70 – 80</w:t>
+        <w:t xml:space="preserve">70 a 80</w:t>
       </w:r>
     </w:p>
     <w:p>
@@ -875,7 +875,7 @@
         <w:pStyle w:val="BodyText"/>
       </w:pPr>
       <w:r>
-        <w:t xml:space="preserve">80 – 95</w:t>
+        <w:t xml:space="preserve">80 a 95</w:t>
       </w:r>
     </w:p>
     <w:p>
@@ -891,7 +891,7 @@
         <w:pStyle w:val="BodyText"/>
       </w:pPr>
       <w:r>
-        <w:t xml:space="preserve">95 – 100</w:t>
+        <w:t xml:space="preserve">95 a 100</w:t>
       </w:r>
     </w:p>
     <w:p>
@@ -907,7 +907,7 @@
         <w:pStyle w:val="BodyText"/>
       </w:pPr>
       <w:r>
-        <w:t xml:space="preserve">100 – 110</w:t>
+        <w:t xml:space="preserve">100 a 110</w:t>
       </w:r>
     </w:p>
     <w:p>
@@ -923,7 +923,7 @@
         <w:pStyle w:val="BodyText"/>
       </w:pPr>
       <w:r>
-        <w:t xml:space="preserve">110 – 115</w:t>
+        <w:t xml:space="preserve">110 a 115</w:t>
       </w:r>
     </w:p>
     <w:p>
@@ -939,7 +939,7 @@
         <w:pStyle w:val="BodyText"/>
       </w:pPr>
       <w:r>
-        <w:t xml:space="preserve">115 – 120</w:t>
+        <w:t xml:space="preserve">115 a 120</w:t>
       </w:r>
     </w:p>
     <w:p>
@@ -955,7 +955,7 @@
         <w:pStyle w:val="BodyText"/>
       </w:pPr>
       <w:r>
-        <w:t xml:space="preserve">120 – 130</w:t>
+        <w:t xml:space="preserve">120 a 130</w:t>
       </w:r>
     </w:p>
     <w:p>
@@ -971,7 +971,7 @@
         <w:pStyle w:val="BodyText"/>
       </w:pPr>
       <w:r>
-        <w:t xml:space="preserve">130 – 140</w:t>
+        <w:t xml:space="preserve">130 a 140</w:t>
       </w:r>
     </w:p>
     <w:p>
@@ -6877,7 +6877,7 @@
         <w:t xml:space="preserve">dos reglas</w:t>
       </w:r>
       <w:r>
-        <w:t xml:space="preserve">. Si se permitieran reglas con cobertura muy baja (por ejemplo, una sola instancia por regla), el algoritmo podría generar tantas reglas como instancias positivas existan, memorizando el conjunto de entrenamiento en lugar de capturar los patrones subyacentes. Este fenómeno se conoce como sobreajuste (</w:t>
+        <w:t xml:space="preserve">. Si se permitieran reglas con cobertura muy baja (por ejemplo, una sola instancia por regla), el algoritmo podría generar tantas reglas como instancias positivas existan, con lo que memorizaría el conjunto de entrenamiento en lugar de capturar los patrones subyacentes. Este fenómeno se conoce como sobreajuste (</w:t>
       </w:r>
       <w:r>
         <w:rPr>
@@ -7402,7 +7402,7 @@
         <w:t xml:space="preserve"> </w:t>
       </w:r>
       <w:r>
-        <w:t xml:space="preserve">la estructura del árbol se traduce directamente en reglas SI–ENTONCES legibles sin necesidad de formación técnica especializada.</w:t>
+        <w:t xml:space="preserve">la estructura del árbol se traduce directamente en reglas de tipo «si… entonces» legibles sin necesidad de formación técnica especializada.</w:t>
       </w:r>
     </w:p>
     <w:p>
@@ -13541,7 +13541,7 @@
         <w:rPr>
           <w:rStyle w:val="VerbatimChar"/>
         </w:rPr>
-        <w:t xml:space="preserve">## C5.0 [Release 2.07 GPL Edition]      Mon Jun 22 11:43:05 2026</w:t>
+        <w:t xml:space="preserve">## C5.0 [Release 2.07 GPL Edition]      Mon Jun 22 12:08:32 2026</w:t>
       </w:r>
       <w:r>
         <w:br/>

</xml_diff>